<commit_message>
fix: report iteration edits
</commit_message>
<xml_diff>
--- a/УЧПРАКТИКА_4345_ГАВРИЛОВ_ЕВ.docx
+++ b/УЧПРАКТИКА_4345_ГАВРИЛОВ_ЕВ.docx
@@ -2721,7 +2721,17 @@
       </w:pPr>
       <w:r>
         <w:rPr/>
-        <w:t>Если N &lt;= 30, тогда целевой функцией является фактическое значение минимального количества операций для перемножения матриц (min_cost) полученное за O(n^3) и является глобальным минимумом, для N = 30, количество операций потраченное на целевую функцию 27000 &lt;&lt; 300000 операций алгоритма с популяцией в 100 особей и 100 поколениями, для меньших N — аналогично. Поэтому оценка оправдана. На практике генетический алгоритм может не достигнуть глобального оптимума, однако в большинстве проведённых экспериментов получаемое решение отличалось от оптимального не более чем на 10-20%.</w:t>
+        <w:t>Если N &lt;= 30, тогда целевой функцией является фактическое значение минимального количества операций для перемножения матриц (min_cost) полученное за O(n</w:t>
+      </w:r>
+      <w:r>
+        <w:rPr>
+          <w:vertAlign w:val="superscript"/>
+        </w:rPr>
+        <w:t>3</w:t>
+      </w:r>
+      <w:r>
+        <w:rPr/>
+        <w:t>) и является глобальным минимумом, для N = 30, количество операций потраченное на целевую функцию 27000 &lt;&lt; 300000 операций алгоритма с популяцией в 100 особей и 100 поколениями, для меньших N — аналогично. Поэтому оценка оправдана. На практике генетический алгоритм может не достигнуть глобального оптимума, однако в большинстве проведённых экспериментов получаемое решение отличалось от оптимального не более чем на 10-20%.</w:t>
       </w:r>
     </w:p>
     <w:p>
@@ -2733,7 +2743,17 @@
       </w:pPr>
       <w:r>
         <w:rPr/>
-        <w:t>Далее, при росте N, из-за сложности O(N^3) количество операций, потраченное на расчет перебором будет стремительно расти, быстрее чем количество операций алгоритма. Поэтому:</w:t>
+        <w:t>Далее, при росте N, из-за сложности O(N</w:t>
+      </w:r>
+      <w:r>
+        <w:rPr>
+          <w:vertAlign w:val="superscript"/>
+        </w:rPr>
+        <w:t>3</w:t>
+      </w:r>
+      <w:r>
+        <w:rPr/>
+        <w:t>) количество операций, потраченное на расчет перебором будет стремительно расти, быстрее чем количество операций алгоритма. Поэтому:</w:t>
       </w:r>
     </w:p>
     <w:p>
@@ -2745,7 +2765,17 @@
       </w:pPr>
       <w:r>
         <w:rPr/>
-        <w:t>Для N&gt;30 точное решение вычислять нецелесообразно. В качестве верхней оценки используется результат жадного алгоритма со сложностью O(n^2). Полученное генетическим алгоритмом решение сравнивается с этой оценкой. Если стоимость решения меньше стоимости, полученной жадным алгоритмом, то генетический алгоритм показал более качественный результат. Отношение стоимости решения генетического алгоритма к верхней оценке используется как показатель качества полученного решения.</w:t>
+        <w:t>Для N&gt;30 точное решение вычислять нецелесообразно. В качестве верхней оценки используется результат жадного алгоритма со сложностью O(n</w:t>
+      </w:r>
+      <w:r>
+        <w:rPr>
+          <w:vertAlign w:val="superscript"/>
+        </w:rPr>
+        <w:t>2</w:t>
+      </w:r>
+      <w:r>
+        <w:rPr/>
+        <w:t>). Полученное генетическим алгоритмом решение сравнивается с этой оценкой. Если стоимость решения меньше стоимости, полученной жадным алгоритмом, то генетический алгоритм показал более качественный результат. Отношение стоимости решения генетического алгоритма к верхней оценке используется как показатель качества полученного решения.</w:t>
       </w:r>
     </w:p>
     <w:p>
@@ -2770,23 +2800,7 @@
       <w:r>
         <w:rPr/>
         <w:tab/>
-        <w:t>Для написания программы выбран язык Python3, поскольку с этим инструментом знакомы все члены команды и для него существует большое количество библиотек для создания графического интерфейса. Для GUI выбрана библиотека PySide6, так как она является портом библиотеки Qt на Python3, наиболее портируема среди аналогов и подробно документирована [</w:t>
-      </w:r>
-      <w:r>
-        <w:rPr/>
-        <w:t>3</w:t>
-      </w:r>
-      <w:r>
-        <w:rPr/>
-        <w:t>,</w:t>
-      </w:r>
-      <w:r>
-        <w:rPr/>
-        <w:t>4</w:t>
-      </w:r>
-      <w:r>
-        <w:rPr/>
-        <w:t>].</w:t>
+        <w:t>Для написания программы выбран язык Python3, поскольку с этим инструментом знакомы все члены команды и для него существует большое количество библиотек для создания графического интерфейса. Для GUI выбрана библиотека PySide6, так как она является портом библиотеки Qt на Python3, наиболее портируема среди аналогов и подробно документирована [3,4].</w:t>
       </w:r>
     </w:p>
     <w:p>
@@ -3140,7 +3154,15 @@
       <w:bookmarkEnd w:id="15"/>
       <w:r>
         <w:rPr/>
-        <w:t xml:space="preserve"> Главное окно MainWindow задаёт заголовок и минимальный размер окна и устанавливает центральным виджетом DashboardPage. Диаграмма классов главного окна приведена на рис. 4.</w:t>
+        <w:t xml:space="preserve"> Главное окно MainWindow задаёт заголовок и минимальный размер окна и устанавливает центральным виджетом DashboardPage. Диаграмма классов главного окна приведена на рис. 4 </w:t>
+      </w:r>
+      <w:r>
+        <w:rPr/>
+        <w:t>в Приложении А</w:t>
+      </w:r>
+      <w:r>
+        <w:rPr/>
+        <w:t>.</w:t>
       </w:r>
     </w:p>
     <w:p>
@@ -3251,7 +3273,15 @@
       </w:pPr>
       <w:r>
         <w:rPr/>
-        <w:t>Диаграмма классов ввода приведена на рис. 3.</w:t>
+        <w:t xml:space="preserve">Диаграмма классов ввода приведена на рис. 3 </w:t>
+      </w:r>
+      <w:r>
+        <w:rPr/>
+        <w:t>в Приложении А</w:t>
+      </w:r>
+      <w:r>
+        <w:rPr/>
+        <w:t>.</w:t>
       </w:r>
     </w:p>
     <w:p>
@@ -3337,7 +3367,15 @@
       </w:pPr>
       <w:r>
         <w:rPr/>
-        <w:t>Разработаны две формы визуализации результатов работы алгоритма: график сходимости и дерево найденного порядка перемножения цепочки матриц. Диаграмма классов визуализации приведена на рис. 1.</w:t>
+        <w:t xml:space="preserve">Разработаны две формы визуализации результатов работы алгоритма: график сходимости и дерево найденного порядка перемножения цепочки матриц. Диаграмма классов визуализации приведена на рис. 1 </w:t>
+      </w:r>
+      <w:r>
+        <w:rPr/>
+        <w:t>в Приложении А</w:t>
+      </w:r>
+      <w:r>
+        <w:rPr/>
+        <w:t>.</w:t>
       </w:r>
     </w:p>
     <w:p>
@@ -3375,10 +3413,14 @@
         <w:rPr/>
         <w:t>С помощью механизма навигации реализовано пошаговое представление алгоритма: каждое переключение шага вызывает соответствующий метод GeneticAlgorithm (go_first_generate, go_prev_generate, go_next_generate, go_last_generate) и перерисовывает график и панель результатов актуальными данными из get_plot_data.</w:t>
       </w:r>
-    </w:p>
-    <w:p>
-      <w:pPr>
-        <w:pStyle w:val="BodyText"/>
+      <w:r>
+        <w:br w:type="page"/>
+      </w:r>
+    </w:p>
+    <w:p>
+      <w:pPr>
+        <w:pStyle w:val="BodyText"/>
+        <w:spacing w:before="0" w:after="0"/>
         <w:rPr>
           <w:b/>
           <w:bCs/>
@@ -3389,25 +3431,6 @@
           <w:b/>
           <w:bCs/>
         </w:rPr>
-      </w:r>
-      <w:r>
-        <w:br w:type="page"/>
-      </w:r>
-    </w:p>
-    <w:p>
-      <w:pPr>
-        <w:pStyle w:val="BodyText"/>
-        <w:spacing w:before="0" w:after="0"/>
-        <w:rPr>
-          <w:b/>
-          <w:bCs/>
-        </w:rPr>
-      </w:pPr>
-      <w:r>
-        <w:rPr>
-          <w:b/>
-          <w:bCs/>
-        </w:rPr>
         <w:t>Визуализация порядка умножения</w:t>
       </w:r>
     </w:p>
@@ -3428,7 +3451,15 @@
       </w:pPr>
       <w:r>
         <w:rPr/>
-        <w:t>Диаграмма классов реализованной программы приведена на рис. 5.</w:t>
+        <w:t xml:space="preserve">Диаграмма классов реализованной программы приведена на рис. 5 </w:t>
+      </w:r>
+      <w:r>
+        <w:rPr/>
+        <w:t>в Приложении А</w:t>
+      </w:r>
+      <w:r>
+        <w:rPr/>
+        <w:t>.</w:t>
       </w:r>
       <w:r>
         <w:br w:type="page"/>
@@ -3461,15 +3492,7 @@
       </w:pPr>
       <w:r>
         <w:rPr/>
-        <w:t>В качестве языка проекта использован Python3. В проекте использована стандартная библиотека Python. Для реализации графического интерфейса использована библиотека PySide6. Диаграммы классов построены с помощью plantuml. Разработка программы проведена с использованием системы контроля версий git, репозиторий размещен на сайте github.com [</w:t>
-      </w:r>
-      <w:r>
-        <w:rPr/>
-        <w:t>5</w:t>
-      </w:r>
-      <w:r>
-        <w:rPr/>
-        <w:t>].</w:t>
+        <w:t>В качестве языка проекта использован Python3. В проекте использована стандартная библиотека Python. Для реализации графического интерфейса использована библиотека PySide6. Диаграммы классов построены с помощью plantuml. Разработка программы проведена с использованием системы контроля версий git, репозиторий размещен на сайте github.com [5].</w:t>
       </w:r>
       <w:r>
         <w:br w:type="page"/>
@@ -3606,8 +3629,8 @@
         </w:rPr>
       </w:pPr>
       <w:bookmarkStart w:id="24" w:name="__RefHeading___Toc1095_2196652226"/>
-      <w:bookmarkStart w:id="25" w:name="_Toc73173388"/>
-      <w:bookmarkStart w:id="26" w:name="_Toc230206156"/>
+      <w:bookmarkStart w:id="25" w:name="_Toc230206156"/>
+      <w:bookmarkStart w:id="26" w:name="_Toc73173388"/>
       <w:bookmarkEnd w:id="24"/>
       <w:r>
         <w:rPr>
@@ -6319,8 +6342,8 @@
       <w:rFonts w:ascii="Liberation Mono" w:hAnsi="Liberation Mono" w:eastAsia="Noto Sans Mono CJK SC" w:cs="Liberation Mono"/>
     </w:rPr>
   </w:style>
-  <w:style w:type="character" w:styleId="Bullets">
-    <w:name w:val="Bullets"/>
+  <w:style w:type="character" w:styleId="Bulletsuser">
+    <w:name w:val="Bullets (user)"/>
     <w:qFormat/>
     <w:rPr>
       <w:rFonts w:ascii="OpenSymbol" w:hAnsi="OpenSymbol" w:eastAsia="OpenSymbol" w:cs="OpenSymbol"/>
@@ -6331,8 +6354,8 @@
     <w:qFormat/>
     <w:rPr/>
   </w:style>
-  <w:style w:type="character" w:styleId="Bulletsuser">
-    <w:name w:val="Bullets (user)"/>
+  <w:style w:type="character" w:styleId="Bullets">
+    <w:name w:val="Bullets"/>
     <w:qFormat/>
     <w:rPr>
       <w:rFonts w:ascii="OpenSymbol" w:hAnsi="OpenSymbol" w:eastAsia="OpenSymbol" w:cs="OpenSymbol"/>

</xml_diff>

<commit_message>
LAST FIX! MISSION COMPLETED
</commit_message>
<xml_diff>
--- a/УЧПРАКТИКА_4345_ГАВРИЛОВ_ЕВ.docx
+++ b/УЧПРАКТИКА_4345_ГАВРИЛОВ_ЕВ.docx
@@ -3121,7 +3121,23 @@
       </w:pPr>
       <w:r>
         <w:rPr/>
-        <w:t>Структура компонентов алгоритма и связи алгоритма с графическим интерфейсом изображены на рис. 1 и рис. 2 в Приложении А.</w:t>
+        <w:t xml:space="preserve">Структура компонентов алгоритма и связи алгоритма с графическим интерфейсом изображены на рис. </w:t>
+      </w:r>
+      <w:r>
+        <w:rPr/>
+        <w:t>2</w:t>
+      </w:r>
+      <w:r>
+        <w:rPr/>
+        <w:t xml:space="preserve"> и рис. </w:t>
+      </w:r>
+      <w:r>
+        <w:rPr/>
+        <w:t>3</w:t>
+      </w:r>
+      <w:r>
+        <w:rPr/>
+        <w:t xml:space="preserve"> в Приложении А.</w:t>
       </w:r>
       <w:bookmarkStart w:id="15" w:name="_Toc230206152"/>
     </w:p>
@@ -3154,15 +3170,15 @@
       <w:bookmarkEnd w:id="15"/>
       <w:r>
         <w:rPr/>
-        <w:t xml:space="preserve"> Главное окно MainWindow задаёт заголовок и минимальный размер окна и устанавливает центральным виджетом DashboardPage. Диаграмма классов главного окна приведена на рис. 4 </w:t>
-      </w:r>
-      <w:r>
-        <w:rPr/>
-        <w:t>в Приложении А</w:t>
-      </w:r>
-      <w:r>
-        <w:rPr/>
-        <w:t>.</w:t>
+        <w:t xml:space="preserve"> Главное окно MainWindow задаёт заголовок и минимальный размер окна и устанавливает центральным виджетом DashboardPage. Диаграмма классов главного окна приведена на рис. </w:t>
+      </w:r>
+      <w:r>
+        <w:rPr/>
+        <w:t>5</w:t>
+      </w:r>
+      <w:r>
+        <w:rPr/>
+        <w:t xml:space="preserve"> в Приложении А.</w:t>
       </w:r>
     </w:p>
     <w:p>
@@ -3273,15 +3289,15 @@
       </w:pPr>
       <w:r>
         <w:rPr/>
-        <w:t xml:space="preserve">Диаграмма классов ввода приведена на рис. 3 </w:t>
-      </w:r>
-      <w:r>
-        <w:rPr/>
-        <w:t>в Приложении А</w:t>
-      </w:r>
-      <w:r>
-        <w:rPr/>
-        <w:t>.</w:t>
+        <w:t xml:space="preserve">Диаграмма классов ввода приведена на рис. </w:t>
+      </w:r>
+      <w:r>
+        <w:rPr/>
+        <w:t>4</w:t>
+      </w:r>
+      <w:r>
+        <w:rPr/>
+        <w:t xml:space="preserve"> в Приложении А.</w:t>
       </w:r>
     </w:p>
     <w:p>
@@ -3367,15 +3383,15 @@
       </w:pPr>
       <w:r>
         <w:rPr/>
-        <w:t xml:space="preserve">Разработаны две формы визуализации результатов работы алгоритма: график сходимости и дерево найденного порядка перемножения цепочки матриц. Диаграмма классов визуализации приведена на рис. 1 </w:t>
-      </w:r>
-      <w:r>
-        <w:rPr/>
-        <w:t>в Приложении А</w:t>
-      </w:r>
-      <w:r>
-        <w:rPr/>
-        <w:t>.</w:t>
+        <w:t xml:space="preserve">Разработаны две формы визуализации результатов работы алгоритма: график сходимости и дерево найденного порядка перемножения цепочки матриц. Диаграмма классов визуализации приведена на рис. </w:t>
+      </w:r>
+      <w:r>
+        <w:rPr/>
+        <w:t>2</w:t>
+      </w:r>
+      <w:r>
+        <w:rPr/>
+        <w:t xml:space="preserve"> в Приложении А.</w:t>
       </w:r>
     </w:p>
     <w:p>
@@ -3451,15 +3467,15 @@
       </w:pPr>
       <w:r>
         <w:rPr/>
-        <w:t xml:space="preserve">Диаграмма классов реализованной программы приведена на рис. 5 </w:t>
-      </w:r>
-      <w:r>
-        <w:rPr/>
-        <w:t>в Приложении А</w:t>
-      </w:r>
-      <w:r>
-        <w:rPr/>
-        <w:t>.</w:t>
+        <w:t xml:space="preserve">Диаграмма классов реализованной программы приведена на рис. </w:t>
+      </w:r>
+      <w:r>
+        <w:rPr/>
+        <w:t>6</w:t>
+      </w:r>
+      <w:r>
+        <w:rPr/>
+        <w:t xml:space="preserve"> в Приложении А.</w:t>
       </w:r>
       <w:r>
         <w:br w:type="page"/>
@@ -3525,6 +3541,75 @@
       <w:r>
         <w:rPr/>
         <w:t>По результатам работы учебная практика оценена на 5.</w:t>
+      </w:r>
+    </w:p>
+    <w:p>
+      <w:pPr>
+        <w:pStyle w:val="BodyText"/>
+        <w:rPr/>
+      </w:pPr>
+      <w:r>
+        <w:rPr/>
+        <w:t>Отзыв руководителя с оценкой (см. рис. 1).</w:t>
+      </w:r>
+    </w:p>
+    <w:p>
+      <w:pPr>
+        <w:pStyle w:val="BodyText"/>
+        <w:ind w:hanging="0" w:start="0"/>
+        <w:jc w:val="center"/>
+        <w:rPr/>
+      </w:pPr>
+      <w:r>
+        <w:rPr/>
+        <w:drawing>
+          <wp:inline distT="0" distB="0" distL="0" distR="0">
+            <wp:extent cx="4344670" cy="6144895"/>
+            <wp:effectExtent l="0" t="0" r="0" b="0"/>
+            <wp:docPr id="1" name="Image6"/>
+            <wp:cNvGraphicFramePr>
+              <a:graphicFrameLocks xmlns:a="http://schemas.openxmlformats.org/drawingml/2006/main" noChangeAspect="1"/>
+            </wp:cNvGraphicFramePr>
+            <a:graphic xmlns:a="http://schemas.openxmlformats.org/drawingml/2006/main">
+              <a:graphicData uri="http://schemas.openxmlformats.org/drawingml/2006/picture">
+                <pic:pic xmlns:pic="http://schemas.openxmlformats.org/drawingml/2006/picture">
+                  <pic:nvPicPr>
+                    <pic:cNvPr id="1" name="Image6"/>
+                    <pic:cNvPicPr>
+                      <a:picLocks noChangeAspect="1" noChangeArrowheads="1"/>
+                    </pic:cNvPicPr>
+                  </pic:nvPicPr>
+                  <pic:blipFill>
+                    <a:blip r:embed="rId2"/>
+                    <a:stretch>
+                      <a:fillRect/>
+                    </a:stretch>
+                  </pic:blipFill>
+                  <pic:spPr bwMode="auto">
+                    <a:xfrm>
+                      <a:off x="0" y="0"/>
+                      <a:ext cx="4344670" cy="6144895"/>
+                    </a:xfrm>
+                    <a:prstGeom prst="rect">
+                      <a:avLst/>
+                    </a:prstGeom>
+                    <a:noFill/>
+                  </pic:spPr>
+                </pic:pic>
+              </a:graphicData>
+            </a:graphic>
+          </wp:inline>
+        </w:drawing>
+      </w:r>
+    </w:p>
+    <w:p>
+      <w:pPr>
+        <w:pStyle w:val="Style19"/>
+        <w:rPr/>
+      </w:pPr>
+      <w:r>
+        <w:rPr/>
+        <w:t>Рисунок 1 — Отзыв руководителя</w:t>
       </w:r>
       <w:r>
         <w:br w:type="page"/>
@@ -3629,8 +3714,8 @@
         </w:rPr>
       </w:pPr>
       <w:bookmarkStart w:id="24" w:name="__RefHeading___Toc1095_2196652226"/>
-      <w:bookmarkStart w:id="25" w:name="_Toc230206156"/>
-      <w:bookmarkStart w:id="26" w:name="_Toc73173388"/>
+      <w:bookmarkStart w:id="25" w:name="_Toc73173388"/>
+      <w:bookmarkStart w:id="26" w:name="_Toc230206156"/>
       <w:bookmarkEnd w:id="24"/>
       <w:r>
         <w:rPr>
@@ -3784,7 +3869,7 @@
           <wp:inline distT="0" distB="0" distL="0" distR="0">
             <wp:extent cx="5311775" cy="2837180"/>
             <wp:effectExtent l="0" t="0" r="0" b="0"/>
-            <wp:docPr id="1" name="Image2"/>
+            <wp:docPr id="2" name="Image2"/>
             <wp:cNvGraphicFramePr>
               <a:graphicFrameLocks xmlns:a="http://schemas.openxmlformats.org/drawingml/2006/main" noChangeAspect="1"/>
             </wp:cNvGraphicFramePr>
@@ -3792,13 +3877,13 @@
               <a:graphicData uri="http://schemas.openxmlformats.org/drawingml/2006/picture">
                 <pic:pic xmlns:pic="http://schemas.openxmlformats.org/drawingml/2006/picture">
                   <pic:nvPicPr>
-                    <pic:cNvPr id="1" name="Image2"/>
+                    <pic:cNvPr id="2" name="Image2"/>
                     <pic:cNvPicPr>
                       <a:picLocks noChangeAspect="1" noChangeArrowheads="1"/>
                     </pic:cNvPicPr>
                   </pic:nvPicPr>
                   <pic:blipFill>
-                    <a:blip r:embed="rId2"/>
+                    <a:blip r:embed="rId3"/>
                     <a:stretch>
                       <a:fillRect/>
                     </a:stretch>
@@ -3827,7 +3912,15 @@
       </w:pPr>
       <w:r>
         <w:rPr/>
-        <w:t>Рисунок 1 — Диаграмма классов визуализации</w:t>
+        <w:t xml:space="preserve">Рисунок </w:t>
+      </w:r>
+      <w:r>
+        <w:rPr/>
+        <w:t>2</w:t>
+      </w:r>
+      <w:r>
+        <w:rPr/>
+        <w:t xml:space="preserve"> — Диаграмма классов визуализации</w:t>
       </w:r>
     </w:p>
     <w:p>
@@ -3843,7 +3936,7 @@
           <wp:inline distT="0" distB="0" distL="0" distR="0">
             <wp:extent cx="4486275" cy="1533525"/>
             <wp:effectExtent l="0" t="0" r="0" b="0"/>
-            <wp:docPr id="2" name="Image1"/>
+            <wp:docPr id="3" name="Image1"/>
             <wp:cNvGraphicFramePr>
               <a:graphicFrameLocks xmlns:a="http://schemas.openxmlformats.org/drawingml/2006/main" noChangeAspect="1"/>
             </wp:cNvGraphicFramePr>
@@ -3851,13 +3944,13 @@
               <a:graphicData uri="http://schemas.openxmlformats.org/drawingml/2006/picture">
                 <pic:pic xmlns:pic="http://schemas.openxmlformats.org/drawingml/2006/picture">
                   <pic:nvPicPr>
-                    <pic:cNvPr id="2" name="Image1"/>
+                    <pic:cNvPr id="3" name="Image1"/>
                     <pic:cNvPicPr>
                       <a:picLocks noChangeAspect="1" noChangeArrowheads="1"/>
                     </pic:cNvPicPr>
                   </pic:nvPicPr>
                   <pic:blipFill>
-                    <a:blip r:embed="rId3"/>
+                    <a:blip r:embed="rId4"/>
                     <a:stretch>
                       <a:fillRect/>
                     </a:stretch>
@@ -3886,7 +3979,15 @@
       </w:pPr>
       <w:r>
         <w:rPr/>
-        <w:t>Рисунок 2 — Диаграмма классов backend</w:t>
+        <w:t xml:space="preserve">Рисунок </w:t>
+      </w:r>
+      <w:r>
+        <w:rPr/>
+        <w:t>3</w:t>
+      </w:r>
+      <w:r>
+        <w:rPr/>
+        <w:t xml:space="preserve"> — Диаграмма классов backend</w:t>
       </w:r>
     </w:p>
     <w:p>
@@ -3901,7 +4002,7 @@
           <wp:inline distT="0" distB="0" distL="0" distR="0">
             <wp:extent cx="5179060" cy="1985645"/>
             <wp:effectExtent l="0" t="0" r="0" b="0"/>
-            <wp:docPr id="3" name="Image3"/>
+            <wp:docPr id="4" name="Image3"/>
             <wp:cNvGraphicFramePr>
               <a:graphicFrameLocks xmlns:a="http://schemas.openxmlformats.org/drawingml/2006/main" noChangeAspect="1"/>
             </wp:cNvGraphicFramePr>
@@ -3909,13 +4010,13 @@
               <a:graphicData uri="http://schemas.openxmlformats.org/drawingml/2006/picture">
                 <pic:pic xmlns:pic="http://schemas.openxmlformats.org/drawingml/2006/picture">
                   <pic:nvPicPr>
-                    <pic:cNvPr id="3" name="Image3"/>
+                    <pic:cNvPr id="4" name="Image3"/>
                     <pic:cNvPicPr>
                       <a:picLocks noChangeAspect="1" noChangeArrowheads="1"/>
                     </pic:cNvPicPr>
                   </pic:nvPicPr>
                   <pic:blipFill>
-                    <a:blip r:embed="rId4"/>
+                    <a:blip r:embed="rId5"/>
                     <a:stretch>
                       <a:fillRect/>
                     </a:stretch>
@@ -3944,7 +4045,15 @@
       </w:pPr>
       <w:r>
         <w:rPr/>
-        <w:t>Рисунок 3 — Диаграмма классов ввода данных и параметров</w:t>
+        <w:t xml:space="preserve">Рисунок </w:t>
+      </w:r>
+      <w:r>
+        <w:rPr/>
+        <w:t>4</w:t>
+      </w:r>
+      <w:r>
+        <w:rPr/>
+        <w:t xml:space="preserve"> — Диаграмма классов ввода данных и параметров</w:t>
       </w:r>
     </w:p>
     <w:p>
@@ -3959,7 +4068,7 @@
           <wp:inline distT="0" distB="0" distL="0" distR="0">
             <wp:extent cx="5523230" cy="2963545"/>
             <wp:effectExtent l="0" t="0" r="0" b="0"/>
-            <wp:docPr id="4" name="Image4"/>
+            <wp:docPr id="5" name="Image4"/>
             <wp:cNvGraphicFramePr>
               <a:graphicFrameLocks xmlns:a="http://schemas.openxmlformats.org/drawingml/2006/main" noChangeAspect="1"/>
             </wp:cNvGraphicFramePr>
@@ -3967,13 +4076,13 @@
               <a:graphicData uri="http://schemas.openxmlformats.org/drawingml/2006/picture">
                 <pic:pic xmlns:pic="http://schemas.openxmlformats.org/drawingml/2006/picture">
                   <pic:nvPicPr>
-                    <pic:cNvPr id="4" name="Image4"/>
+                    <pic:cNvPr id="5" name="Image4"/>
                     <pic:cNvPicPr>
                       <a:picLocks noChangeAspect="1" noChangeArrowheads="1"/>
                     </pic:cNvPicPr>
                   </pic:nvPicPr>
                   <pic:blipFill>
-                    <a:blip r:embed="rId5"/>
+                    <a:blip r:embed="rId6"/>
                     <a:stretch>
                       <a:fillRect/>
                     </a:stretch>
@@ -4002,7 +4111,15 @@
       </w:pPr>
       <w:r>
         <w:rPr/>
-        <w:t>Рисунок 4 — Диаграмма классов главного окна</w:t>
+        <w:t xml:space="preserve">Рисунок </w:t>
+      </w:r>
+      <w:r>
+        <w:rPr/>
+        <w:t>5</w:t>
+      </w:r>
+      <w:r>
+        <w:rPr/>
+        <w:t xml:space="preserve"> — Диаграмма классов главного окна</w:t>
       </w:r>
     </w:p>
     <w:p>
@@ -4017,7 +4134,7 @@
           <wp:inline distT="0" distB="0" distL="0" distR="0">
             <wp:extent cx="5723255" cy="2568575"/>
             <wp:effectExtent l="0" t="0" r="0" b="0"/>
-            <wp:docPr id="5" name="Image5"/>
+            <wp:docPr id="6" name="Image5"/>
             <wp:cNvGraphicFramePr>
               <a:graphicFrameLocks xmlns:a="http://schemas.openxmlformats.org/drawingml/2006/main" noChangeAspect="1"/>
             </wp:cNvGraphicFramePr>
@@ -4025,13 +4142,13 @@
               <a:graphicData uri="http://schemas.openxmlformats.org/drawingml/2006/picture">
                 <pic:pic xmlns:pic="http://schemas.openxmlformats.org/drawingml/2006/picture">
                   <pic:nvPicPr>
-                    <pic:cNvPr id="5" name="Image5"/>
+                    <pic:cNvPr id="6" name="Image5"/>
                     <pic:cNvPicPr>
                       <a:picLocks noChangeAspect="1" noChangeArrowheads="1"/>
                     </pic:cNvPicPr>
                   </pic:nvPicPr>
                   <pic:blipFill>
-                    <a:blip r:embed="rId6"/>
+                    <a:blip r:embed="rId7"/>
                     <a:stretch>
                       <a:fillRect/>
                     </a:stretch>
@@ -4060,13 +4177,21 @@
       </w:pPr>
       <w:r>
         <w:rPr/>
-        <w:t>Рисунок 5 — Общая диаграмма классов программы</w:t>
+        <w:t xml:space="preserve">Рисунок </w:t>
+      </w:r>
+      <w:r>
+        <w:rPr/>
+        <w:t>6</w:t>
+      </w:r>
+      <w:r>
+        <w:rPr/>
+        <w:t xml:space="preserve"> — Общая диаграмма классов программы</w:t>
       </w:r>
     </w:p>
     <w:sectPr>
-      <w:footerReference w:type="even" r:id="rId7"/>
-      <w:footerReference w:type="default" r:id="rId8"/>
-      <w:footerReference w:type="first" r:id="rId9"/>
+      <w:footerReference w:type="even" r:id="rId8"/>
+      <w:footerReference w:type="default" r:id="rId9"/>
+      <w:footerReference w:type="first" r:id="rId10"/>
       <w:type w:val="nextPage"/>
       <w:pgSz w:w="11906" w:h="16838"/>
       <w:pgMar w:left="1701" w:right="850" w:gutter="0" w:header="0" w:top="1134" w:footer="708" w:bottom="1134"/>
@@ -6342,8 +6467,8 @@
       <w:rFonts w:ascii="Liberation Mono" w:hAnsi="Liberation Mono" w:eastAsia="Noto Sans Mono CJK SC" w:cs="Liberation Mono"/>
     </w:rPr>
   </w:style>
-  <w:style w:type="character" w:styleId="Bulletsuser">
-    <w:name w:val="Bullets (user)"/>
+  <w:style w:type="character" w:styleId="Bullets">
+    <w:name w:val="Bullets"/>
     <w:qFormat/>
     <w:rPr>
       <w:rFonts w:ascii="OpenSymbol" w:hAnsi="OpenSymbol" w:eastAsia="OpenSymbol" w:cs="OpenSymbol"/>
@@ -6354,8 +6479,8 @@
     <w:qFormat/>
     <w:rPr/>
   </w:style>
-  <w:style w:type="character" w:styleId="Bullets">
-    <w:name w:val="Bullets"/>
+  <w:style w:type="character" w:styleId="Bulletsuser">
+    <w:name w:val="Bullets (user)"/>
     <w:qFormat/>
     <w:rPr>
       <w:rFonts w:ascii="OpenSymbol" w:hAnsi="OpenSymbol" w:eastAsia="OpenSymbol" w:cs="OpenSymbol"/>

</xml_diff>